<commit_message>
Add Feature Download Gabungan
</commit_message>
<xml_diff>
--- a/public/templates/BAST PML.docx
+++ b/public/templates/BAST PML.docx
@@ -5387,7 +5387,7 @@
     <w:tbl>
       <w:tblPr>
         <w:tblStyle w:val="a1"/>
-        <w:tblW w:w="10485" w:type="dxa"/>
+        <w:tblW w:w="12469" w:type="dxa"/>
         <w:jc w:val="center"/>
         <w:tblInd w:w="0" w:type="dxa"/>
         <w:tblBorders>
@@ -5404,9 +5404,9 @@
       <w:tblGrid>
         <w:gridCol w:w="891"/>
         <w:gridCol w:w="2703"/>
-        <w:gridCol w:w="2797"/>
-        <w:gridCol w:w="1649"/>
-        <w:gridCol w:w="2445"/>
+        <w:gridCol w:w="3347"/>
+        <w:gridCol w:w="2552"/>
+        <w:gridCol w:w="2976"/>
       </w:tblGrid>
       <w:tr>
         <w:trPr>
@@ -5501,7 +5501,7 @@
         </w:tc>
         <w:tc>
           <w:tcPr>
-            <w:tcW w:w="2797" w:type="dxa"/>
+            <w:tcW w:w="3347" w:type="dxa"/>
             <w:vAlign w:val="center"/>
           </w:tcPr>
           <w:p>
@@ -5526,7 +5526,7 @@
         </w:tc>
         <w:tc>
           <w:tcPr>
-            <w:tcW w:w="1649" w:type="dxa"/>
+            <w:tcW w:w="2552" w:type="dxa"/>
             <w:vAlign w:val="center"/>
           </w:tcPr>
           <w:p>
@@ -5551,7 +5551,7 @@
         </w:tc>
         <w:tc>
           <w:tcPr>
-            <w:tcW w:w="2445" w:type="dxa"/>
+            <w:tcW w:w="2976" w:type="dxa"/>
             <w:vAlign w:val="center"/>
           </w:tcPr>
           <w:p>
@@ -5581,6 +5581,14 @@
                 <w:szCs w:val="24"/>
               </w:rPr>
               <w:t xml:space="preserve"> SLS/Sub-SLS</w:t>
+            </w:r>
+            <w:r>
+              <w:rPr>
+                <w:rFonts w:ascii="Bookman Old Style" w:eastAsia="Bookman Old Style" w:hAnsi="Bookman Old Style" w:cs="Bookman Old Style"/>
+                <w:sz w:val="24"/>
+                <w:szCs w:val="24"/>
+              </w:rPr>
+              <w:t>*</w:t>
             </w:r>
           </w:p>
         </w:tc>
@@ -5642,7 +5650,7 @@
         </w:tc>
         <w:tc>
           <w:tcPr>
-            <w:tcW w:w="2797" w:type="dxa"/>
+            <w:tcW w:w="3347" w:type="dxa"/>
             <w:vAlign w:val="center"/>
           </w:tcPr>
           <w:p>
@@ -5667,7 +5675,7 @@
         </w:tc>
         <w:tc>
           <w:tcPr>
-            <w:tcW w:w="1649" w:type="dxa"/>
+            <w:tcW w:w="2552" w:type="dxa"/>
             <w:vAlign w:val="center"/>
           </w:tcPr>
           <w:p>
@@ -5692,7 +5700,7 @@
         </w:tc>
         <w:tc>
           <w:tcPr>
-            <w:tcW w:w="2445" w:type="dxa"/>
+            <w:tcW w:w="2976" w:type="dxa"/>
             <w:vAlign w:val="center"/>
           </w:tcPr>
           <w:p>
@@ -5729,6 +5737,7 @@
           <w:p>
             <w:pPr>
               <w:widowControl/>
+              <w:jc w:val="center"/>
               <w:rPr>
                 <w:rFonts w:ascii="Bookman Old Style" w:eastAsia="Bookman Old Style" w:hAnsi="Bookman Old Style" w:cs="Bookman Old Style"/>
                 <w:sz w:val="24"/>
@@ -5808,7 +5817,7 @@
         </w:tc>
         <w:tc>
           <w:tcPr>
-            <w:tcW w:w="2797" w:type="dxa"/>
+            <w:tcW w:w="3347" w:type="dxa"/>
             <w:vAlign w:val="center"/>
           </w:tcPr>
           <w:p>
@@ -5851,7 +5860,7 @@
         </w:tc>
         <w:tc>
           <w:tcPr>
-            <w:tcW w:w="1649" w:type="dxa"/>
+            <w:tcW w:w="2552" w:type="dxa"/>
             <w:vAlign w:val="center"/>
           </w:tcPr>
           <w:p>
@@ -5894,7 +5903,7 @@
         </w:tc>
         <w:tc>
           <w:tcPr>
-            <w:tcW w:w="2445" w:type="dxa"/>
+            <w:tcW w:w="2976" w:type="dxa"/>
             <w:vAlign w:val="center"/>
           </w:tcPr>
           <w:p>
@@ -5955,6 +5964,150 @@
         </w:tc>
       </w:tr>
     </w:tbl>
+    <w:p>
+      <w:pPr>
+        <w:ind w:left="426"/>
+        <w:rPr>
+          <w:rFonts w:ascii="Bookman Old Style" w:eastAsia="Bookman Old Style" w:hAnsi="Bookman Old Style" w:cs="Bookman Old Style"/>
+          <w:sz w:val="24"/>
+          <w:szCs w:val="24"/>
+        </w:rPr>
+      </w:pPr>
+      <w:r>
+        <w:rPr>
+          <w:rFonts w:ascii="Bookman Old Style" w:eastAsia="Bookman Old Style" w:hAnsi="Bookman Old Style" w:cs="Bookman Old Style"/>
+          <w:sz w:val="24"/>
+          <w:szCs w:val="24"/>
+        </w:rPr>
+        <w:t>*</w:t>
+      </w:r>
+      <w:proofErr w:type="spellStart"/>
+      <w:r>
+        <w:rPr>
+          <w:rFonts w:ascii="Bookman Old Style" w:eastAsia="Bookman Old Style" w:hAnsi="Bookman Old Style" w:cs="Bookman Old Style"/>
+          <w:i/>
+          <w:iCs/>
+        </w:rPr>
+        <w:t>Mempertimbangkan</w:t>
+      </w:r>
+      <w:proofErr w:type="spellEnd"/>
+      <w:r>
+        <w:rPr>
+          <w:rFonts w:ascii="Bookman Old Style" w:eastAsia="Bookman Old Style" w:hAnsi="Bookman Old Style" w:cs="Bookman Old Style"/>
+          <w:i/>
+          <w:iCs/>
+        </w:rPr>
+        <w:t xml:space="preserve"> 40% </w:t>
+      </w:r>
+      <w:proofErr w:type="spellStart"/>
+      <w:r>
+        <w:rPr>
+          <w:rFonts w:ascii="Bookman Old Style" w:eastAsia="Bookman Old Style" w:hAnsi="Bookman Old Style" w:cs="Bookman Old Style"/>
+          <w:i/>
+          <w:iCs/>
+        </w:rPr>
+        <w:t>muatan</w:t>
+      </w:r>
+      <w:proofErr w:type="spellEnd"/>
+      <w:r>
+        <w:rPr>
+          <w:rFonts w:ascii="Bookman Old Style" w:eastAsia="Bookman Old Style" w:hAnsi="Bookman Old Style" w:cs="Bookman Old Style"/>
+          <w:i/>
+          <w:iCs/>
+        </w:rPr>
+        <w:t xml:space="preserve"> </w:t>
+      </w:r>
+      <w:proofErr w:type="spellStart"/>
+      <w:r>
+        <w:rPr>
+          <w:rFonts w:ascii="Bookman Old Style" w:eastAsia="Bookman Old Style" w:hAnsi="Bookman Old Style" w:cs="Bookman Old Style"/>
+          <w:i/>
+          <w:iCs/>
+        </w:rPr>
+        <w:t>sesuai</w:t>
+      </w:r>
+      <w:proofErr w:type="spellEnd"/>
+      <w:r>
+        <w:rPr>
+          <w:rFonts w:ascii="Bookman Old Style" w:eastAsia="Bookman Old Style" w:hAnsi="Bookman Old Style" w:cs="Bookman Old Style"/>
+          <w:i/>
+          <w:iCs/>
+        </w:rPr>
+        <w:t xml:space="preserve"> </w:t>
+      </w:r>
+      <w:proofErr w:type="spellStart"/>
+      <w:r>
+        <w:rPr>
+          <w:rFonts w:ascii="Bookman Old Style" w:eastAsia="Bookman Old Style" w:hAnsi="Bookman Old Style" w:cs="Bookman Old Style"/>
+          <w:i/>
+          <w:iCs/>
+        </w:rPr>
+        <w:t>dengan</w:t>
+      </w:r>
+      <w:proofErr w:type="spellEnd"/>
+      <w:r>
+        <w:rPr>
+          <w:rFonts w:ascii="Bookman Old Style" w:eastAsia="Bookman Old Style" w:hAnsi="Bookman Old Style" w:cs="Bookman Old Style"/>
+          <w:i/>
+          <w:iCs/>
+        </w:rPr>
+        <w:t xml:space="preserve"> Surat </w:t>
+      </w:r>
+      <w:proofErr w:type="spellStart"/>
+      <w:r>
+        <w:rPr>
+          <w:rFonts w:ascii="Bookman Old Style" w:eastAsia="Bookman Old Style" w:hAnsi="Bookman Old Style" w:cs="Bookman Old Style"/>
+          <w:i/>
+          <w:iCs/>
+        </w:rPr>
+        <w:t>Sekretaris</w:t>
+      </w:r>
+      <w:proofErr w:type="spellEnd"/>
+      <w:r>
+        <w:rPr>
+          <w:rFonts w:ascii="Bookman Old Style" w:eastAsia="Bookman Old Style" w:hAnsi="Bookman Old Style" w:cs="Bookman Old Style"/>
+          <w:i/>
+          <w:iCs/>
+        </w:rPr>
+        <w:t xml:space="preserve"> Utama BPS </w:t>
+      </w:r>
+      <w:proofErr w:type="spellStart"/>
+      <w:r>
+        <w:rPr>
+          <w:rFonts w:ascii="Bookman Old Style" w:eastAsia="Bookman Old Style" w:hAnsi="Bookman Old Style" w:cs="Bookman Old Style"/>
+          <w:i/>
+          <w:iCs/>
+        </w:rPr>
+        <w:t>nomor</w:t>
+      </w:r>
+      <w:proofErr w:type="spellEnd"/>
+      <w:r>
+        <w:rPr>
+          <w:rFonts w:ascii="Bookman Old Style" w:eastAsia="Bookman Old Style" w:hAnsi="Bookman Old Style" w:cs="Bookman Old Style"/>
+          <w:i/>
+          <w:iCs/>
+        </w:rPr>
+        <w:t xml:space="preserve">: B-523/02000/SS.100/2026 </w:t>
+      </w:r>
+      <w:proofErr w:type="spellStart"/>
+      <w:r>
+        <w:rPr>
+          <w:rFonts w:ascii="Bookman Old Style" w:eastAsia="Bookman Old Style" w:hAnsi="Bookman Old Style" w:cs="Bookman Old Style"/>
+          <w:i/>
+          <w:iCs/>
+        </w:rPr>
+        <w:t>tanggal</w:t>
+      </w:r>
+      <w:proofErr w:type="spellEnd"/>
+      <w:r>
+        <w:rPr>
+          <w:rFonts w:ascii="Bookman Old Style" w:eastAsia="Bookman Old Style" w:hAnsi="Bookman Old Style" w:cs="Bookman Old Style"/>
+          <w:i/>
+          <w:iCs/>
+        </w:rPr>
+        <w:t xml:space="preserve"> 14 Juli 2026</w:t>
+      </w:r>
+    </w:p>
     <w:p>
       <w:pPr>
         <w:ind w:left="1440"/>

</xml_diff>